<commit_message>
chore: archive old manuscript versions and update chapter and appendix documents
</commit_message>
<xml_diff>
--- a/thesis_docs/manuscripts/Appendix v1.docx
+++ b/thesis_docs/manuscripts/Appendix v1.docx
@@ -76,6 +76,719 @@
       <w:r>
         <w:t>: Exogenous severe weather disruptions (convective storm lines, winter blizzards) are captured through departure delay distributions and flight cancellation indicators reported in BTS Form 234.</w:t>
       </w:r>
+    </w:p>
+    <w:p>
+      <w:pPr>
+        <w:pStyle w:val="ListParagraph"/>
+        <w:numPr>
+          <w:ilvl w:val="0"/>
+          <w:numId w:val="2"/>
+        </w:numPr>
+        <w:spacing w:before="240" w:line="240" w:lineRule="auto"/>
+        <w:rPr>
+          <w:b/>
+        </w:rPr>
+      </w:pPr>
+      <w:r>
+        <w:rPr>
+          <w:b/>
+        </w:rPr>
+        <w:t>Table 2.1</w:t>
+      </w:r>
+    </w:p>
+    <w:p>
+      <w:pPr>
+        <w:pStyle w:val="ListParagraph"/>
+        <w:numPr>
+          <w:ilvl w:val="0"/>
+          <w:numId w:val="2"/>
+        </w:numPr>
+        <w:spacing w:before="240" w:line="240" w:lineRule="auto"/>
+      </w:pPr>
+    </w:p>
+    <w:p>
+      <w:pPr>
+        <w:pStyle w:val="ListParagraph"/>
+        <w:numPr>
+          <w:ilvl w:val="0"/>
+          <w:numId w:val="2"/>
+        </w:numPr>
+        <w:spacing w:after="120" w:line="240" w:lineRule="auto"/>
+      </w:pPr>
+      <w:r>
+        <w:rPr>
+          <w:i/>
+        </w:rPr>
+        <w:t>Comparative Modeling Paradigm Taxonomy for Airport Passenger Screening Throughput</w:t>
+      </w:r>
+    </w:p>
+    <w:tbl>
+      <w:tblPr>
+        <w:tblW w:w="0" w:type="auto"/>
+        <w:jc w:val="center"/>
+        <w:tblBorders>
+          <w:top w:val="single" w:sz="6" w:space="0" w:color="000000"/>
+          <w:bottom w:val="single" w:sz="6" w:space="0" w:color="000000"/>
+        </w:tblBorders>
+        <w:tblLook w:val="04A0" w:firstRow="1" w:lastRow="0" w:firstColumn="1" w:lastColumn="0" w:noHBand="0" w:noVBand="1"/>
+      </w:tblPr>
+      <w:tblGrid>
+        <w:gridCol w:w="1644"/>
+        <w:gridCol w:w="2370"/>
+        <w:gridCol w:w="1786"/>
+        <w:gridCol w:w="1830"/>
+        <w:gridCol w:w="1730"/>
+      </w:tblGrid>
+      <w:tr>
+        <w:trPr>
+          <w:jc w:val="center"/>
+        </w:trPr>
+        <w:tc>
+          <w:tcPr>
+            <w:tcW w:w="1728" w:type="dxa"/>
+            <w:tcBorders>
+              <w:bottom w:val="single" w:sz="6" w:space="0" w:color="000000"/>
+            </w:tcBorders>
+          </w:tcPr>
+          <w:p>
+            <w:pPr>
+              <w:spacing w:before="40" w:after="40" w:line="240" w:lineRule="auto"/>
+            </w:pPr>
+            <w:r>
+              <w:rPr>
+                <w:b/>
+                <w:sz w:val="20"/>
+              </w:rPr>
+              <w:t>Modeling Paradigm</w:t>
+            </w:r>
+          </w:p>
+        </w:tc>
+        <w:tc>
+          <w:tcPr>
+            <w:tcW w:w="1872" w:type="dxa"/>
+            <w:tcBorders>
+              <w:bottom w:val="single" w:sz="6" w:space="0" w:color="000000"/>
+            </w:tcBorders>
+          </w:tcPr>
+          <w:p>
+            <w:pPr>
+              <w:spacing w:before="40" w:after="40" w:line="240" w:lineRule="auto"/>
+            </w:pPr>
+            <w:r>
+              <w:rPr>
+                <w:b/>
+                <w:sz w:val="20"/>
+              </w:rPr>
+              <w:t>Mathematical Foundation</w:t>
+            </w:r>
+          </w:p>
+        </w:tc>
+        <w:tc>
+          <w:tcPr>
+            <w:tcW w:w="1872" w:type="dxa"/>
+            <w:tcBorders>
+              <w:bottom w:val="single" w:sz="6" w:space="0" w:color="000000"/>
+            </w:tcBorders>
+          </w:tcPr>
+          <w:p>
+            <w:pPr>
+              <w:spacing w:before="40" w:after="40" w:line="240" w:lineRule="auto"/>
+            </w:pPr>
+            <w:r>
+              <w:rPr>
+                <w:b/>
+                <w:sz w:val="20"/>
+              </w:rPr>
+              <w:t>Operational Strengths</w:t>
+            </w:r>
+          </w:p>
+        </w:tc>
+        <w:tc>
+          <w:tcPr>
+            <w:tcW w:w="2016" w:type="dxa"/>
+            <w:tcBorders>
+              <w:bottom w:val="single" w:sz="6" w:space="0" w:color="000000"/>
+            </w:tcBorders>
+          </w:tcPr>
+          <w:p>
+            <w:pPr>
+              <w:spacing w:before="40" w:after="40" w:line="240" w:lineRule="auto"/>
+            </w:pPr>
+            <w:r>
+              <w:rPr>
+                <w:b/>
+                <w:sz w:val="20"/>
+              </w:rPr>
+              <w:t>Critical Operational Limitations</w:t>
+            </w:r>
+          </w:p>
+        </w:tc>
+        <w:tc>
+          <w:tcPr>
+            <w:tcW w:w="1872" w:type="dxa"/>
+            <w:tcBorders>
+              <w:bottom w:val="single" w:sz="6" w:space="0" w:color="000000"/>
+            </w:tcBorders>
+          </w:tcPr>
+          <w:p>
+            <w:pPr>
+              <w:spacing w:before="40" w:after="40" w:line="240" w:lineRule="auto"/>
+            </w:pPr>
+            <w:r>
+              <w:rPr>
+                <w:b/>
+                <w:sz w:val="20"/>
+              </w:rPr>
+              <w:t>Key Citations</w:t>
+            </w:r>
+          </w:p>
+        </w:tc>
+      </w:tr>
+      <w:tr>
+        <w:trPr>
+          <w:jc w:val="center"/>
+        </w:trPr>
+        <w:tc>
+          <w:tcPr>
+            <w:tcW w:w="1728" w:type="dxa"/>
+          </w:tcPr>
+          <w:p>
+            <w:pPr>
+              <w:spacing w:before="60" w:after="60" w:line="240" w:lineRule="auto"/>
+            </w:pPr>
+            <w:r>
+              <w:rPr>
+                <w:b/>
+                <w:sz w:val="19"/>
+              </w:rPr>
+              <w:t>Classical Queuing Theory</w:t>
+            </w:r>
+          </w:p>
+        </w:tc>
+        <w:tc>
+          <w:tcPr>
+            <w:tcW w:w="1872" w:type="dxa"/>
+          </w:tcPr>
+          <w:p>
+            <w:pPr>
+              <w:spacing w:before="60" w:after="60" w:line="240" w:lineRule="auto"/>
+            </w:pPr>
+            <w:r>
+              <w:rPr>
+                <w:sz w:val="19"/>
+              </w:rPr>
+              <w:t>Poisson / Exponential: M/M/s, M/G/s, NHPP</w:t>
+            </w:r>
+          </w:p>
+        </w:tc>
+        <w:tc>
+          <w:tcPr>
+            <w:tcW w:w="1872" w:type="dxa"/>
+          </w:tcPr>
+          <w:p>
+            <w:pPr>
+              <w:spacing w:before="60" w:after="60" w:line="240" w:lineRule="auto"/>
+            </w:pPr>
+            <w:r>
+              <w:rPr>
+                <w:sz w:val="19"/>
+              </w:rPr>
+              <w:t>Closed-form solutions; transparent parameterization; negligible compute latency.</w:t>
+            </w:r>
+          </w:p>
+        </w:tc>
+        <w:tc>
+          <w:tcPr>
+            <w:tcW w:w="2016" w:type="dxa"/>
+          </w:tcPr>
+          <w:p>
+            <w:pPr>
+              <w:spacing w:before="60" w:after="60" w:line="240" w:lineRule="auto"/>
+            </w:pPr>
+            <w:r>
+              <w:rPr>
+                <w:sz w:val="19"/>
+              </w:rPr>
+              <w:t>Fails under batch flight banks; ignores airside connecting passenger shielding; assumes static arrival rates.</w:t>
+            </w:r>
+          </w:p>
+        </w:tc>
+        <w:tc>
+          <w:tcPr>
+            <w:tcW w:w="1872" w:type="dxa"/>
+          </w:tcPr>
+          <w:p>
+            <w:pPr>
+              <w:spacing w:before="60" w:after="60" w:line="240" w:lineRule="auto"/>
+            </w:pPr>
+            <w:r>
+              <w:rPr>
+                <w:sz w:val="19"/>
+              </w:rPr>
+              <w:t>Odoni (1986); Wang (2018); Brunetta et al. (1999); Guo et al. (2022).</w:t>
+            </w:r>
+          </w:p>
+        </w:tc>
+      </w:tr>
+      <w:tr>
+        <w:trPr>
+          <w:jc w:val="center"/>
+        </w:trPr>
+        <w:tc>
+          <w:tcPr>
+            <w:tcW w:w="1728" w:type="dxa"/>
+          </w:tcPr>
+          <w:p>
+            <w:pPr>
+              <w:spacing w:before="60" w:after="60" w:line="240" w:lineRule="auto"/>
+            </w:pPr>
+            <w:r>
+              <w:rPr>
+                <w:b/>
+                <w:sz w:val="19"/>
+              </w:rPr>
+              <w:t>Discrete Event Simulation (DES)</w:t>
+            </w:r>
+          </w:p>
+        </w:tc>
+        <w:tc>
+          <w:tcPr>
+            <w:tcW w:w="1872" w:type="dxa"/>
+          </w:tcPr>
+          <w:p>
+            <w:pPr>
+              <w:spacing w:before="60" w:after="60" w:line="240" w:lineRule="auto"/>
+            </w:pPr>
+            <w:r>
+              <w:rPr>
+                <w:sz w:val="19"/>
+              </w:rPr>
+              <w:t>Stochastic entity tracking through discrete physical screening stages.</w:t>
+            </w:r>
+          </w:p>
+        </w:tc>
+        <w:tc>
+          <w:tcPr>
+            <w:tcW w:w="1872" w:type="dxa"/>
+          </w:tcPr>
+          <w:p>
+            <w:pPr>
+              <w:spacing w:before="60" w:after="60" w:line="240" w:lineRule="auto"/>
+            </w:pPr>
+            <w:r>
+              <w:rPr>
+                <w:sz w:val="19"/>
+              </w:rPr>
+              <w:t>High micro-level spatial and lane layout fidelity; granular TSO lane configuration.</w:t>
+            </w:r>
+          </w:p>
+        </w:tc>
+        <w:tc>
+          <w:tcPr>
+            <w:tcW w:w="2016" w:type="dxa"/>
+          </w:tcPr>
+          <w:p>
+            <w:pPr>
+              <w:spacing w:before="60" w:after="60" w:line="240" w:lineRule="auto"/>
+            </w:pPr>
+            <w:r>
+              <w:rPr>
+                <w:sz w:val="19"/>
+              </w:rPr>
+              <w:t>Extreme calibration sensitivity; high compute latency during disruptions; passive traveler assumptions.</w:t>
+            </w:r>
+          </w:p>
+        </w:tc>
+        <w:tc>
+          <w:tcPr>
+            <w:tcW w:w="1872" w:type="dxa"/>
+          </w:tcPr>
+          <w:p>
+            <w:pPr>
+              <w:spacing w:before="60" w:after="60" w:line="240" w:lineRule="auto"/>
+            </w:pPr>
+            <w:r>
+              <w:rPr>
+                <w:sz w:val="19"/>
+              </w:rPr>
+              <w:t>Brown &amp; Madhavan (2011); Takakuwa &amp; Oyama (2004); Bießlich et al. (2014).</w:t>
+            </w:r>
+          </w:p>
+        </w:tc>
+      </w:tr>
+      <w:tr>
+        <w:trPr>
+          <w:jc w:val="center"/>
+        </w:trPr>
+        <w:tc>
+          <w:tcPr>
+            <w:tcW w:w="1728" w:type="dxa"/>
+          </w:tcPr>
+          <w:p>
+            <w:pPr>
+              <w:spacing w:before="60" w:after="60" w:line="240" w:lineRule="auto"/>
+            </w:pPr>
+            <w:r>
+              <w:rPr>
+                <w:b/>
+                <w:sz w:val="19"/>
+              </w:rPr>
+              <w:lastRenderedPageBreak/>
+              <w:t>Linear Statistical Time-Series</w:t>
+            </w:r>
+          </w:p>
+        </w:tc>
+        <w:tc>
+          <w:tcPr>
+            <w:tcW w:w="1872" w:type="dxa"/>
+          </w:tcPr>
+          <w:p>
+            <w:pPr>
+              <w:spacing w:before="60" w:after="60" w:line="240" w:lineRule="auto"/>
+            </w:pPr>
+            <w:r>
+              <w:rPr>
+                <w:sz w:val="19"/>
+              </w:rPr>
+              <w:t>Autoregressive moving average: SARIMAX(p,d,q)x(P,D,Q)s</w:t>
+            </w:r>
+          </w:p>
+        </w:tc>
+        <w:tc>
+          <w:tcPr>
+            <w:tcW w:w="1872" w:type="dxa"/>
+          </w:tcPr>
+          <w:p>
+            <w:pPr>
+              <w:spacing w:before="60" w:after="60" w:line="240" w:lineRule="auto"/>
+            </w:pPr>
+            <w:r>
+              <w:rPr>
+                <w:sz w:val="19"/>
+              </w:rPr>
+              <w:t>Lightweight; captures diurnal (24h) and weekly (168h) cycles; clear confidence bounds.</w:t>
+            </w:r>
+          </w:p>
+        </w:tc>
+        <w:tc>
+          <w:tcPr>
+            <w:tcW w:w="2016" w:type="dxa"/>
+          </w:tcPr>
+          <w:p>
+            <w:pPr>
+              <w:spacing w:before="60" w:after="60" w:line="240" w:lineRule="auto"/>
+            </w:pPr>
+            <w:r>
+              <w:rPr>
+                <w:sz w:val="19"/>
+              </w:rPr>
+              <w:t>Fails during structural breaks and severe weather ground stops; cannot model non-linear delays.</w:t>
+            </w:r>
+          </w:p>
+        </w:tc>
+        <w:tc>
+          <w:tcPr>
+            <w:tcW w:w="1872" w:type="dxa"/>
+          </w:tcPr>
+          <w:p>
+            <w:pPr>
+              <w:spacing w:before="60" w:after="60" w:line="240" w:lineRule="auto"/>
+            </w:pPr>
+            <w:r>
+              <w:rPr>
+                <w:sz w:val="19"/>
+              </w:rPr>
+              <w:t>Li et al. (2017); Box et al. (2015); Hyndman &amp; Athanasopoulos (2018).</w:t>
+            </w:r>
+          </w:p>
+        </w:tc>
+      </w:tr>
+      <w:tr>
+        <w:trPr>
+          <w:jc w:val="center"/>
+        </w:trPr>
+        <w:tc>
+          <w:tcPr>
+            <w:tcW w:w="1728" w:type="dxa"/>
+          </w:tcPr>
+          <w:p>
+            <w:pPr>
+              <w:spacing w:before="60" w:after="60" w:line="240" w:lineRule="auto"/>
+            </w:pPr>
+            <w:r>
+              <w:rPr>
+                <w:b/>
+                <w:sz w:val="19"/>
+              </w:rPr>
+              <w:t>Supervised Machine Learning (GBM)</w:t>
+            </w:r>
+          </w:p>
+        </w:tc>
+        <w:tc>
+          <w:tcPr>
+            <w:tcW w:w="1872" w:type="dxa"/>
+          </w:tcPr>
+          <w:p>
+            <w:pPr>
+              <w:spacing w:before="60" w:after="60" w:line="240" w:lineRule="auto"/>
+            </w:pPr>
+            <w:r>
+              <w:rPr>
+                <w:sz w:val="19"/>
+              </w:rPr>
+              <w:t>Non-linear decision trees: Gradient Boosting (HistGBM) minimizing Tweedie loss</w:t>
+            </w:r>
+          </w:p>
+        </w:tc>
+        <w:tc>
+          <w:tcPr>
+            <w:tcW w:w="1872" w:type="dxa"/>
+          </w:tcPr>
+          <w:p>
+            <w:pPr>
+              <w:spacing w:before="60" w:after="60" w:line="240" w:lineRule="auto"/>
+            </w:pPr>
+            <w:r>
+              <w:rPr>
+                <w:sz w:val="19"/>
+              </w:rPr>
+              <w:t>Captures non-linear delays, aircraft gauge, and weather; fast inference; auditable rules.</w:t>
+            </w:r>
+          </w:p>
+        </w:tc>
+        <w:tc>
+          <w:tcPr>
+            <w:tcW w:w="2016" w:type="dxa"/>
+          </w:tcPr>
+          <w:p>
+            <w:pPr>
+              <w:spacing w:before="60" w:after="60" w:line="240" w:lineRule="auto"/>
+            </w:pPr>
+            <w:r>
+              <w:rPr>
+                <w:sz w:val="19"/>
+              </w:rPr>
+              <w:t>Susceptible to "Empty Checkpoint Fallacy" during flight delays; overfits to local terminal geometry.</w:t>
+            </w:r>
+          </w:p>
+        </w:tc>
+        <w:tc>
+          <w:tcPr>
+            <w:tcW w:w="1872" w:type="dxa"/>
+          </w:tcPr>
+          <w:p>
+            <w:pPr>
+              <w:spacing w:before="60" w:after="60" w:line="240" w:lineRule="auto"/>
+            </w:pPr>
+            <w:r>
+              <w:rPr>
+                <w:sz w:val="19"/>
+              </w:rPr>
+              <w:t>Hopfe et al. (2024); Ribeiro et al. (2025); Chen &amp; Guestrin (2016).</w:t>
+            </w:r>
+          </w:p>
+        </w:tc>
+      </w:tr>
+      <w:tr>
+        <w:trPr>
+          <w:jc w:val="center"/>
+        </w:trPr>
+        <w:tc>
+          <w:tcPr>
+            <w:tcW w:w="1728" w:type="dxa"/>
+          </w:tcPr>
+          <w:p>
+            <w:pPr>
+              <w:spacing w:before="60" w:after="60" w:line="240" w:lineRule="auto"/>
+            </w:pPr>
+            <w:r>
+              <w:rPr>
+                <w:b/>
+                <w:sz w:val="19"/>
+              </w:rPr>
+              <w:t>Deep Neural Networks (LSTM / GRU)</w:t>
+            </w:r>
+          </w:p>
+        </w:tc>
+        <w:tc>
+          <w:tcPr>
+            <w:tcW w:w="1872" w:type="dxa"/>
+          </w:tcPr>
+          <w:p>
+            <w:pPr>
+              <w:spacing w:before="60" w:after="60" w:line="240" w:lineRule="auto"/>
+            </w:pPr>
+            <w:r>
+              <w:rPr>
+                <w:sz w:val="19"/>
+              </w:rPr>
+              <w:t>Recurrent hidden state: Gated recurrent units h_t = σ(Whh·h_t-1 + Wxh·x_t + b)</w:t>
+            </w:r>
+          </w:p>
+        </w:tc>
+        <w:tc>
+          <w:tcPr>
+            <w:tcW w:w="1872" w:type="dxa"/>
+          </w:tcPr>
+          <w:p>
+            <w:pPr>
+              <w:spacing w:before="60" w:after="60" w:line="240" w:lineRule="auto"/>
+            </w:pPr>
+            <w:r>
+              <w:rPr>
+                <w:sz w:val="19"/>
+              </w:rPr>
+              <w:t>Directly models complex long-sequence dependencies without manual feature engineering.</w:t>
+            </w:r>
+          </w:p>
+        </w:tc>
+        <w:tc>
+          <w:tcPr>
+            <w:tcW w:w="2016" w:type="dxa"/>
+          </w:tcPr>
+          <w:p>
+            <w:pPr>
+              <w:spacing w:before="60" w:after="60" w:line="240" w:lineRule="auto"/>
+            </w:pPr>
+            <w:r>
+              <w:rPr>
+                <w:sz w:val="19"/>
+              </w:rPr>
+              <w:t>Complete "black-box" opacity; FSD adoption resistance; severe spatial transfer degradation (&gt;40% error).</w:t>
+            </w:r>
+          </w:p>
+        </w:tc>
+        <w:tc>
+          <w:tcPr>
+            <w:tcW w:w="1872" w:type="dxa"/>
+          </w:tcPr>
+          <w:p>
+            <w:pPr>
+              <w:spacing w:before="60" w:after="60" w:line="240" w:lineRule="auto"/>
+            </w:pPr>
+            <w:r>
+              <w:rPr>
+                <w:sz w:val="19"/>
+              </w:rPr>
+              <w:t>Hochreiter &amp; Schmidhuber (1997); Adadi &amp; Berrada (2018); Viaña et al. (2024); Wang et al. (2025).</w:t>
+            </w:r>
+          </w:p>
+        </w:tc>
+      </w:tr>
+      <w:tr>
+        <w:trPr>
+          <w:jc w:val="center"/>
+        </w:trPr>
+        <w:tc>
+          <w:tcPr>
+            <w:tcW w:w="1728" w:type="dxa"/>
+          </w:tcPr>
+          <w:p>
+            <w:pPr>
+              <w:spacing w:before="60" w:after="60" w:line="240" w:lineRule="auto"/>
+            </w:pPr>
+            <w:r>
+              <w:rPr>
+                <w:b/>
+                <w:sz w:val="19"/>
+              </w:rPr>
+              <w:t>Sequential Two-Stage State-Space Hybrids</w:t>
+            </w:r>
+          </w:p>
+        </w:tc>
+        <w:tc>
+          <w:tcPr>
+            <w:tcW w:w="1872" w:type="dxa"/>
+          </w:tcPr>
+          <w:p>
+            <w:pPr>
+              <w:spacing w:before="60" w:after="60" w:line="240" w:lineRule="auto"/>
+            </w:pPr>
+            <w:r>
+              <w:rPr>
+                <w:sz w:val="19"/>
+              </w:rPr>
+              <w:t>Stage 1 Physical Schedule + Stage 2 Tree Residual + Kalman Innovation Feedback</w:t>
+            </w:r>
+          </w:p>
+        </w:tc>
+        <w:tc>
+          <w:tcPr>
+            <w:tcW w:w="1872" w:type="dxa"/>
+          </w:tcPr>
+          <w:p>
+            <w:pPr>
+              <w:spacing w:before="60" w:after="60" w:line="240" w:lineRule="auto"/>
+            </w:pPr>
+            <w:r>
+              <w:rPr>
+                <w:sz w:val="19"/>
+              </w:rPr>
+              <w:t>Superior routine accuracy; high disruption resilience (R_MASE); high cross-airport portability.</w:t>
+            </w:r>
+          </w:p>
+        </w:tc>
+        <w:tc>
+          <w:tcPr>
+            <w:tcW w:w="2016" w:type="dxa"/>
+          </w:tcPr>
+          <w:p>
+            <w:pPr>
+              <w:spacing w:before="60" w:after="60" w:line="240" w:lineRule="auto"/>
+            </w:pPr>
+            <w:r>
+              <w:rPr>
+                <w:sz w:val="19"/>
+              </w:rPr>
+              <w:t>Multi-stage training complexity; requires automated ingestion of live prior-hour floor throughput (y_t-1).</w:t>
+            </w:r>
+          </w:p>
+        </w:tc>
+        <w:tc>
+          <w:tcPr>
+            <w:tcW w:w="1872" w:type="dxa"/>
+          </w:tcPr>
+          <w:p>
+            <w:pPr>
+              <w:spacing w:before="60" w:after="60" w:line="240" w:lineRule="auto"/>
+            </w:pPr>
+            <w:r>
+              <w:rPr>
+                <w:sz w:val="19"/>
+              </w:rPr>
+              <w:t>Brun et al. (2025); Had et al. (2025); Ebert et al. (2021); Wu et al. (2024).</w:t>
+            </w:r>
+          </w:p>
+        </w:tc>
+      </w:tr>
+    </w:tbl>
+    <w:p>
+      <w:pPr>
+        <w:pStyle w:val="ListParagraph"/>
+        <w:numPr>
+          <w:ilvl w:val="0"/>
+          <w:numId w:val="2"/>
+        </w:numPr>
+        <w:spacing w:before="80" w:after="240" w:line="240" w:lineRule="auto"/>
+      </w:pPr>
+      <w:r>
+        <w:rPr>
+          <w:i/>
+          <w:sz w:val="20"/>
+        </w:rPr>
+        <w:t xml:space="preserve">Note. </w:t>
+      </w:r>
+      <w:r>
+        <w:rPr>
+          <w:sz w:val="20"/>
+        </w:rPr>
+        <w:t>Table synthesized from thesis literature review.</w:t>
+      </w:r>
+    </w:p>
+    <w:p>
+      <w:pPr>
+        <w:ind w:firstLine="0"/>
+      </w:pPr>
     </w:p>
     <w:p>
       <w:pPr>
@@ -900,7 +1613,13 @@
                         <w:rPr>
                           <w:rFonts w:ascii="Cambria Math" w:hAnsi="Cambria Math"/>
                         </w:rPr>
-                        <m:t>d,h</m:t>
+                        <m:t>d</m:t>
+                      </m:r>
+                      <m:r>
+                        <w:rPr>
+                          <w:rFonts w:ascii="Cambria Math" w:hAnsi="Cambria Math"/>
+                        </w:rPr>
+                        <m:t>,h</m:t>
                       </m:r>
                     </m:sub>
                   </m:sSub>
@@ -1656,7 +2375,13 @@
                     <w:rPr>
                       <w:rFonts w:ascii="Cambria Math" w:hAnsi="Cambria Math"/>
                     </w:rPr>
-                    <m:t>k=0</m:t>
+                    <m:t>k</m:t>
+                  </m:r>
+                  <m:r>
+                    <w:rPr>
+                      <w:rFonts w:ascii="Cambria Math" w:hAnsi="Cambria Math"/>
+                    </w:rPr>
+                    <m:t>=0</m:t>
                   </m:r>
                 </m:sub>
                 <m:sup>
@@ -1708,7 +2433,19 @@
                         <w:rPr>
                           <w:rFonts w:ascii="Cambria Math" w:hAnsi="Cambria Math"/>
                         </w:rPr>
-                        <m:t>d-k</m:t>
+                        <m:t>d</m:t>
+                      </m:r>
+                      <m:r>
+                        <w:rPr>
+                          <w:rFonts w:ascii="Cambria Math" w:hAnsi="Cambria Math"/>
+                        </w:rPr>
+                        <m:t>-</m:t>
+                      </m:r>
+                      <m:r>
+                        <w:rPr>
+                          <w:rFonts w:ascii="Cambria Math" w:hAnsi="Cambria Math"/>
+                        </w:rPr>
+                        <m:t>k</m:t>
                       </m:r>
                     </m:sub>
                   </m:sSub>
@@ -1751,7 +2488,13 @@
                         <w:rPr>
                           <w:rFonts w:ascii="Cambria Math" w:hAnsi="Cambria Math"/>
                         </w:rPr>
-                        <m:t>7d</m:t>
+                        <m:t>7</m:t>
+                      </m:r>
+                      <m:r>
+                        <w:rPr>
+                          <w:rFonts w:ascii="Cambria Math" w:hAnsi="Cambria Math"/>
+                        </w:rPr>
+                        <m:t>d</m:t>
                       </m:r>
                     </m:sub>
                   </m:sSub>
@@ -1885,7 +2628,13 @@
                 <w:rPr>
                   <w:rFonts w:ascii="Cambria Math" w:hAnsi="Cambria Math"/>
                 </w:rPr>
-                <m:t>,d</m:t>
+                <m:t>,</m:t>
+              </m:r>
+              <m:r>
+                <w:rPr>
+                  <w:rFonts w:ascii="Cambria Math" w:hAnsi="Cambria Math"/>
+                </w:rPr>
+                <m:t>d</m:t>
               </m:r>
             </m:sub>
           </m:sSub>
@@ -1972,7 +2721,13 @@
                     <w:rPr>
                       <w:rFonts w:ascii="Cambria Math" w:hAnsi="Cambria Math"/>
                     </w:rPr>
-                    <m:t>i=1</m:t>
+                    <m:t>i</m:t>
+                  </m:r>
+                  <m:r>
+                    <w:rPr>
+                      <w:rFonts w:ascii="Cambria Math" w:hAnsi="Cambria Math"/>
+                    </w:rPr>
+                    <m:t>=1</m:t>
                   </m:r>
                 </m:sub>
                 <m:sup>
@@ -2043,7 +2798,19 @@
                         <w:rPr>
                           <w:rFonts w:ascii="Cambria Math" w:hAnsi="Cambria Math"/>
                         </w:rPr>
-                        <m:t>d,i</m:t>
+                        <m:t>d</m:t>
+                      </m:r>
+                      <m:r>
+                        <w:rPr>
+                          <w:rFonts w:ascii="Cambria Math" w:hAnsi="Cambria Math"/>
+                        </w:rPr>
+                        <m:t>,</m:t>
+                      </m:r>
+                      <m:r>
+                        <w:rPr>
+                          <w:rFonts w:ascii="Cambria Math" w:hAnsi="Cambria Math"/>
+                        </w:rPr>
+                        <m:t>i</m:t>
                       </m:r>
                     </m:sub>
                   </m:sSub>
@@ -2193,7 +2960,13 @@
             <w:rPr>
               <w:rFonts w:ascii="Cambria Math" w:hAnsi="Cambria Math"/>
             </w:rPr>
-            <m:t>=C</m:t>
+            <m:t>=</m:t>
+          </m:r>
+          <m:r>
+            <w:rPr>
+              <w:rFonts w:ascii="Cambria Math" w:hAnsi="Cambria Math"/>
+            </w:rPr>
+            <m:t>C</m:t>
           </m:r>
           <m:sSub>
             <m:sSubPr>
@@ -2222,7 +2995,13 @@
                 <w:rPr>
                   <w:rFonts w:ascii="Cambria Math" w:hAnsi="Cambria Math"/>
                 </w:rPr>
-                <m:t>,d</m:t>
+                <m:t>,</m:t>
+              </m:r>
+              <m:r>
+                <w:rPr>
+                  <w:rFonts w:ascii="Cambria Math" w:hAnsi="Cambria Math"/>
+                </w:rPr>
+                <m:t>d</m:t>
               </m:r>
             </m:sub>
           </m:sSub>
@@ -2259,7 +3038,13 @@
                 <w:rPr>
                   <w:rFonts w:ascii="Cambria Math" w:hAnsi="Cambria Math"/>
                 </w:rPr>
-                <m:t>,d</m:t>
+                <m:t>,</m:t>
+              </m:r>
+              <m:r>
+                <w:rPr>
+                  <w:rFonts w:ascii="Cambria Math" w:hAnsi="Cambria Math"/>
+                </w:rPr>
+                <m:t>d</m:t>
               </m:r>
             </m:sub>
           </m:sSub>
@@ -2452,7 +3237,13 @@
                             <w:rPr>
                               <w:rFonts w:ascii="Cambria Math" w:hAnsi="Cambria Math"/>
                             </w:rPr>
-                            <m:t>,dow</m:t>
+                            <m:t>,</m:t>
+                          </m:r>
+                          <m:r>
+                            <w:rPr>
+                              <w:rFonts w:ascii="Cambria Math" w:hAnsi="Cambria Math"/>
+                            </w:rPr>
+                            <m:t>dow</m:t>
                           </m:r>
                         </m:sub>
                       </m:sSub>
@@ -2530,7 +3321,13 @@
                             <w:rPr>
                               <w:rFonts w:ascii="Cambria Math" w:hAnsi="Cambria Math"/>
                             </w:rPr>
-                            <m:t>,dow</m:t>
+                            <m:t>,</m:t>
+                          </m:r>
+                          <m:r>
+                            <w:rPr>
+                              <w:rFonts w:ascii="Cambria Math" w:hAnsi="Cambria Math"/>
+                            </w:rPr>
+                            <m:t>dow</m:t>
                           </m:r>
                         </m:sub>
                       </m:sSub>
@@ -2608,7 +3405,13 @@
                                 <w:rPr>
                                   <w:rFonts w:ascii="Cambria Math" w:hAnsi="Cambria Math"/>
                                 </w:rPr>
-                                <m:t>,dow</m:t>
+                                <m:t>,</m:t>
+                              </m:r>
+                              <m:r>
+                                <w:rPr>
+                                  <w:rFonts w:ascii="Cambria Math" w:hAnsi="Cambria Math"/>
+                                </w:rPr>
+                                <m:t>dow</m:t>
                               </m:r>
                             </m:sub>
                           </m:sSub>
@@ -2662,7 +3465,13 @@
                                 <w:rPr>
                                   <w:rFonts w:ascii="Cambria Math" w:hAnsi="Cambria Math"/>
                                 </w:rPr>
-                                <m:t>,dow</m:t>
+                                <m:t>,</m:t>
+                              </m:r>
+                              <m:r>
+                                <w:rPr>
+                                  <w:rFonts w:ascii="Cambria Math" w:hAnsi="Cambria Math"/>
+                                </w:rPr>
+                                <m:t>dow</m:t>
                               </m:r>
                             </m:sub>
                           </m:sSub>
@@ -2686,13 +3495,19 @@
                         </m:e>
                       </m:d>
                       <m:r>
+                        <w:rPr>
+                          <w:rFonts w:ascii="Cambria Math" w:hAnsi="Cambria Math"/>
+                        </w:rPr>
+                        <m:t>⋅</m:t>
+                      </m:r>
+                      <m:r>
                         <m:rPr>
                           <m:scr m:val="double-struck"/>
                         </m:rPr>
                         <w:rPr>
                           <w:rFonts w:ascii="Cambria Math" w:hAnsi="Cambria Math"/>
                         </w:rPr>
-                        <m:t>⋅I</m:t>
+                        <m:t>I</m:t>
                       </m:r>
                       <m:d>
                         <m:dPr>
@@ -2842,7 +3657,13 @@
                                     <w:rPr>
                                       <w:rFonts w:ascii="Cambria Math" w:hAnsi="Cambria Math"/>
                                     </w:rPr>
-                                    <m:t>,dow</m:t>
+                                    <m:t>,</m:t>
+                                  </m:r>
+                                  <m:r>
+                                    <w:rPr>
+                                      <w:rFonts w:ascii="Cambria Math" w:hAnsi="Cambria Math"/>
+                                    </w:rPr>
+                                    <m:t>dow</m:t>
                                   </m:r>
                                 </m:sub>
                               </m:sSub>
@@ -2896,7 +3717,13 @@
                                     <w:rPr>
                                       <w:rFonts w:ascii="Cambria Math" w:hAnsi="Cambria Math"/>
                                     </w:rPr>
-                                    <m:t>,dow</m:t>
+                                    <m:t>,</m:t>
+                                  </m:r>
+                                  <m:r>
+                                    <w:rPr>
+                                      <w:rFonts w:ascii="Cambria Math" w:hAnsi="Cambria Math"/>
+                                    </w:rPr>
+                                    <m:t>dow</m:t>
                                   </m:r>
                                 </m:sub>
                               </m:sSub>
@@ -2920,13 +3747,19 @@
                             </m:e>
                           </m:d>
                           <m:r>
+                            <w:rPr>
+                              <w:rFonts w:ascii="Cambria Math" w:hAnsi="Cambria Math"/>
+                            </w:rPr>
+                            <m:t>⋅</m:t>
+                          </m:r>
+                          <m:r>
                             <m:rPr>
                               <m:scr m:val="double-struck"/>
                             </m:rPr>
                             <w:rPr>
                               <w:rFonts w:ascii="Cambria Math" w:hAnsi="Cambria Math"/>
                             </w:rPr>
-                            <m:t>⋅I</m:t>
+                            <m:t>I</m:t>
                           </m:r>
                           <m:d>
                             <m:dPr>
@@ -7319,7 +8152,13 @@
                 <w:rPr>
                   <w:rFonts w:ascii="Cambria Math" w:hAnsi="Cambria Math"/>
                 </w:rPr>
-                <m:t>,t</m:t>
+                <m:t>,</m:t>
+              </m:r>
+              <m:r>
+                <w:rPr>
+                  <w:rFonts w:ascii="Cambria Math" w:hAnsi="Cambria Math"/>
+                </w:rPr>
+                <m:t>t</m:t>
               </m:r>
             </m:sub>
           </m:sSub>
@@ -7424,7 +8263,13 @@
                     <w:rPr>
                       <w:rFonts w:ascii="Cambria Math" w:hAnsi="Cambria Math"/>
                     </w:rPr>
-                    <m:t>f∈</m:t>
+                    <m:t>f</m:t>
+                  </m:r>
+                  <m:r>
+                    <w:rPr>
+                      <w:rFonts w:ascii="Cambria Math" w:hAnsi="Cambria Math"/>
+                    </w:rPr>
+                    <m:t>∈</m:t>
                   </m:r>
                   <m:sSub>
                     <m:sSubPr>
@@ -7450,7 +8295,13 @@
                         <w:rPr>
                           <w:rFonts w:ascii="Cambria Math" w:hAnsi="Cambria Math"/>
                         </w:rPr>
-                        <m:t>t+h</m:t>
+                        <m:t>t</m:t>
+                      </m:r>
+                      <m:r>
+                        <w:rPr>
+                          <w:rFonts w:ascii="Cambria Math" w:hAnsi="Cambria Math"/>
+                        </w:rPr>
+                        <m:t>+h</m:t>
                       </m:r>
                     </m:sub>
                   </m:sSub>

</xml_diff>